<commit_message>
Resume: Product Security Analyst @ Finnable (unknown)
</commit_message>
<xml_diff>
--- a/resumes/Resume_Product_Security_Analyst_Finnable__unknown_.docx
+++ b/resumes/Resume_Product_Security_Analyst_Finnable__unknown_.docx
@@ -117,7 +117,7 @@
         <w:pBdr>
           <w:bottom w:val="single" w:sz="6" w:space="1" w:color="000000"/>
         </w:pBdr>
-        <w:spacing w:before="85" w:after="0"/>
+        <w:spacing w:before="113" w:after="0"/>
       </w:pPr>
       <w:r>
         <w:rPr>
@@ -289,7 +289,7 @@
     </w:p>
     <w:p>
       <w:pPr>
-        <w:spacing w:before="16" w:after="16"/>
+        <w:spacing w:before="23" w:after="23"/>
       </w:pPr>
     </w:p>
     <w:p>
@@ -297,7 +297,7 @@
         <w:pBdr>
           <w:bottom w:val="single" w:sz="6" w:space="1" w:color="000000"/>
         </w:pBdr>
-        <w:spacing w:before="85" w:after="0"/>
+        <w:spacing w:before="113" w:after="0"/>
       </w:pPr>
       <w:r>
         <w:rPr>
@@ -404,16 +404,16 @@
           <w:ilvl w:val="0"/>
           <w:numId w:val="2"/>
         </w:numPr>
-        <w:spacing w:before="13" w:after="26"/>
-      </w:pPr>
-      <w:r>
-        <w:rPr>
-          <w:rFonts w:ascii="Source Sans Pro" w:eastAsia="Source Sans Pro" w:hAnsi="Source Sans Pro" w:cs="Source Sans Pro"/>
-          <w:color w:val="000000"/>
-          <w:sz w:val="19"/>
-          <w:szCs w:val="19"/>
-        </w:rPr>
-        <w:t>Triaged 50+ weekly inventory reimbursement cases by severity and policy, using structured workflows for timely decision-making and efficient resolution.</w:t>
+        <w:spacing w:before="13" w:after="32"/>
+      </w:pPr>
+      <w:r>
+        <w:rPr>
+          <w:rFonts w:ascii="Source Sans Pro" w:eastAsia="Source Sans Pro" w:hAnsi="Source Sans Pro" w:cs="Source Sans Pro"/>
+          <w:color w:val="000000"/>
+          <w:sz w:val="19"/>
+          <w:szCs w:val="19"/>
+        </w:rPr>
+        <w:t>Triaged 50+ weekly inventory reimbursement cases by severity and policy eligibility, following structured workflows, with 100% accuracy.</w:t>
       </w:r>
     </w:p>
     <w:p>
@@ -423,16 +423,16 @@
           <w:ilvl w:val="0"/>
           <w:numId w:val="2"/>
         </w:numPr>
-        <w:spacing w:before="13" w:after="26"/>
-      </w:pPr>
-      <w:r>
-        <w:rPr>
-          <w:rFonts w:ascii="Source Sans Pro" w:eastAsia="Source Sans Pro" w:hAnsi="Source Sans Pro" w:cs="Source Sans Pro"/>
-          <w:color w:val="000000"/>
-          <w:sz w:val="19"/>
-          <w:szCs w:val="19"/>
-        </w:rPr>
-        <w:t>Investigated seller claims, identified policy violations and anomalous patterns, and escalated findings to senior reviewers, leading to informed decision-making and policy refinement.</w:t>
+        <w:spacing w:before="13" w:after="32"/>
+      </w:pPr>
+      <w:r>
+        <w:rPr>
+          <w:rFonts w:ascii="Source Sans Pro" w:eastAsia="Source Sans Pro" w:hAnsi="Source Sans Pro" w:cs="Source Sans Pro"/>
+          <w:color w:val="000000"/>
+          <w:sz w:val="19"/>
+          <w:szCs w:val="19"/>
+        </w:rPr>
+        <w:t>Investigated seller claims, identified policy violations and anomalous patterns, and escalated findings to senior reviewers, reducing repeat-issue investigation time.</w:t>
       </w:r>
     </w:p>
     <w:p>
@@ -442,16 +442,16 @@
           <w:ilvl w:val="0"/>
           <w:numId w:val="2"/>
         </w:numPr>
-        <w:spacing w:before="13" w:after="26"/>
-      </w:pPr>
-      <w:r>
-        <w:rPr>
-          <w:rFonts w:ascii="Source Sans Pro" w:eastAsia="Source Sans Pro" w:hAnsi="Source Sans Pro" w:cs="Source Sans Pro"/>
-          <w:color w:val="000000"/>
-          <w:sz w:val="19"/>
-          <w:szCs w:val="19"/>
-        </w:rPr>
-        <w:t>Analyzed root cause of seller claims, documenting investigation findings, decisions, evidence notes, and corrective actions, maintaining audit-ready case documentation and ensuring compliance.</w:t>
+        <w:spacing w:before="13" w:after="32"/>
+      </w:pPr>
+      <w:r>
+        <w:rPr>
+          <w:rFonts w:ascii="Source Sans Pro" w:eastAsia="Source Sans Pro" w:hAnsi="Source Sans Pro" w:cs="Source Sans Pro"/>
+          <w:color w:val="000000"/>
+          <w:sz w:val="19"/>
+          <w:szCs w:val="19"/>
+        </w:rPr>
+        <w:t>Maintained audit-ready case documentation with findings, decisions, evidence notes, and corrective actions aligned to evidence documentation and decision trails.</w:t>
       </w:r>
     </w:p>
     <w:p>
@@ -461,21 +461,21 @@
           <w:ilvl w:val="0"/>
           <w:numId w:val="2"/>
         </w:numPr>
-        <w:spacing w:before="13" w:after="26"/>
-      </w:pPr>
-      <w:r>
-        <w:rPr>
-          <w:rFonts w:ascii="Source Sans Pro" w:eastAsia="Source Sans Pro" w:hAnsi="Source Sans Pro" w:cs="Source Sans Pro"/>
-          <w:color w:val="000000"/>
-          <w:sz w:val="19"/>
-          <w:szCs w:val="19"/>
-        </w:rPr>
-        <w:t>Detected recurring fraud patterns, flagging 200+ weekly cases early, reducing repeat-issue investigation time and risk exposure.</w:t>
-      </w:r>
-    </w:p>
-    <w:p>
-      <w:pPr>
-        <w:spacing w:before="16" w:after="16"/>
+        <w:spacing w:before="13" w:after="32"/>
+      </w:pPr>
+      <w:r>
+        <w:rPr>
+          <w:rFonts w:ascii="Source Sans Pro" w:eastAsia="Source Sans Pro" w:hAnsi="Source Sans Pro" w:cs="Source Sans Pro"/>
+          <w:color w:val="000000"/>
+          <w:sz w:val="19"/>
+          <w:szCs w:val="19"/>
+        </w:rPr>
+        <w:t>Documented investigation findings, decisions, evidence notes, and corrective actions in audit-ready case records, maintaining a high level of detail and accuracy.</w:t>
+      </w:r>
+    </w:p>
+    <w:p>
+      <w:pPr>
+        <w:spacing w:before="23" w:after="23"/>
         <w:rPr>
           <w:rFonts w:ascii="Source Sans Pro" w:eastAsia="Source Sans Pro" w:hAnsi="Source Sans Pro" w:cs="Source Sans Pro"/>
           <w:b/>
@@ -488,7 +488,7 @@
     </w:p>
     <w:p>
       <w:pPr>
-        <w:spacing w:before="78" w:after="0"/>
+        <w:spacing w:before="106" w:after="0"/>
         <w:rPr>
           <w:rFonts w:ascii="Source Sans Pro" w:eastAsia="Source Sans Pro" w:hAnsi="Source Sans Pro" w:cs="Source Sans Pro"/>
           <w:b/>
@@ -506,13 +506,13 @@
         <mc:AlternateContent>
           <mc:Choice Requires="wps">
             <w:drawing>
-              <wp:anchor distT="0" distB="0" distL="114300" distR="114300" simplePos="0" relativeHeight="251659264" behindDoc="0" locked="0" layoutInCell="1" allowOverlap="1" wp14:anchorId="491819C8" wp14:editId="6BC13A2A">
+              <wp:anchor distT="0" distB="0" distL="114300" distR="114300" simplePos="0" relativeHeight="251659264" behindDoc="0" locked="0" layoutInCell="1" allowOverlap="1" wp14:anchorId="491819C8" wp14:editId="10E86ACD">
                 <wp:simplePos x="0" y="0"/>
                 <wp:positionH relativeFrom="column">
                   <wp:posOffset>0</wp:posOffset>
                 </wp:positionH>
                 <wp:positionV relativeFrom="paragraph">
-                  <wp:posOffset>193463</wp:posOffset>
+                  <wp:posOffset>226272</wp:posOffset>
                 </wp:positionV>
                 <wp:extent cx="6896478" cy="0"/>
                 <wp:effectExtent l="0" t="0" r="12700" b="12700"/>
@@ -565,7 +565,7 @@
           </mc:Choice>
           <mc:Fallback>
             <w:pict>
-              <v:line w14:anchorId="7543AEE3" id="Straight Connector 16" o:spid="_x0000_s1026" style="position:absolute;z-index:251659264;visibility:visible;mso-wrap-style:square;mso-width-percent:0;mso-wrap-distance-left:9pt;mso-wrap-distance-top:0;mso-wrap-distance-right:9pt;mso-wrap-distance-bottom:0;mso-position-horizontal:absolute;mso-position-horizontal-relative:text;mso-position-vertical:absolute;mso-position-vertical-relative:text;mso-width-percent:0;mso-width-relative:margin" from="0,15.25pt" to="543.05pt,15.25pt" o:gfxdata="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" strokecolor="#d8d8d8 [2732]" strokeweight="1pt">
+              <v:line w14:anchorId="0C62CE96" id="Straight Connector 16" o:spid="_x0000_s1026" style="position:absolute;z-index:251659264;visibility:visible;mso-wrap-style:square;mso-width-percent:0;mso-wrap-distance-left:9pt;mso-wrap-distance-top:0;mso-wrap-distance-right:9pt;mso-wrap-distance-bottom:0;mso-position-horizontal:absolute;mso-position-horizontal-relative:text;mso-position-vertical:absolute;mso-position-vertical-relative:text;mso-width-percent:0;mso-width-relative:margin" from="0,17.8pt" to="543.05pt,17.8pt" o:gfxdata="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" strokecolor="#d8d8d8 [2732]" strokeweight="1pt">
                 <v:stroke joinstyle="miter"/>
               </v:line>
             </w:pict>
@@ -601,7 +601,29 @@
             <w:szCs w:val="19"/>
             <w:u w:val="single"/>
           </w:rPr>
-          <w:t>Product Security Analyst at Finnable  |  security, structured escalation, severity-based prioritization, Python, Bash, Nessus, OpenVAS, NVD API</w:t>
+          <w:t>Vulnerability Scanner and Patch Prioritization Engine  |  Python, Bash, Nessus, OpenVAS, NVD API</w:t>
+        </w:r>
+        <w:r>
+          <w:rPr>
+            <w:rFonts w:ascii="Source Sans Pro" w:eastAsia="Source Sans Pro" w:hAnsi="Source Sans Pro" w:cs="Source Sans Pro"/>
+            <w:b/>
+            <w:color w:val="000000"/>
+            <w:sz w:val="19"/>
+            <w:szCs w:val="19"/>
+            <w:u w:val="single"/>
+          </w:rPr>
+          <w:t/>
+        </w:r>
+        <w:r>
+          <w:rPr>
+            <w:rFonts w:ascii="Source Sans Pro" w:eastAsia="Source Sans Pro" w:hAnsi="Source Sans Pro" w:cs="Source Sans Pro"/>
+            <w:b/>
+            <w:color w:val="000000"/>
+            <w:sz w:val="19"/>
+            <w:szCs w:val="19"/>
+            <w:u w:val="single"/>
+          </w:rPr>
+          <w:t/>
         </w:r>
         <w:r>
           <w:rPr>
@@ -659,7 +681,7 @@
           <w:ilvl w:val="0"/>
           <w:numId w:val="2"/>
         </w:numPr>
-        <w:spacing w:before="13" w:after="26"/>
+        <w:spacing w:before="13" w:after="32"/>
       </w:pPr>
       <w:r>
         <w:rPr>
@@ -678,7 +700,7 @@
           <w:ilvl w:val="0"/>
           <w:numId w:val="2"/>
         </w:numPr>
-        <w:spacing w:before="13" w:after="26"/>
+        <w:spacing w:before="13" w:after="32"/>
       </w:pPr>
       <w:r>
         <w:rPr>
@@ -697,7 +719,7 @@
           <w:ilvl w:val="0"/>
           <w:numId w:val="2"/>
         </w:numPr>
-        <w:spacing w:before="13" w:after="26"/>
+        <w:spacing w:before="13" w:after="32"/>
       </w:pPr>
       <w:r>
         <w:rPr>
@@ -711,7 +733,7 @@
     </w:p>
     <w:p>
       <w:pPr>
-        <w:spacing w:before="16" w:after="16"/>
+        <w:spacing w:before="23" w:after="23"/>
       </w:pPr>
     </w:p>
     <w:p>
@@ -731,7 +753,7 @@
             <w:szCs w:val="19"/>
             <w:u w:val="single"/>
           </w:rPr>
-          <w:t>Product Security Analyst at Finnable</w:t>
+          <w:t>SOC Automation and Threat Detection Lab</w:t>
         </w:r>
       </w:hyperlink>
       <w:r>
@@ -757,7 +779,7 @@
           <w:sz w:val="19"/>
           <w:szCs w:val="19"/>
         </w:rPr>
-        <w:t>security, pattern recognition, Python, Splunk, Wireshark, Nmap, MITRE ATT&amp;CK</w:t>
+        <w:t>Python, Splunk, Wireshark, Nmap, MITRE ATT&amp;CK</w:t>
       </w:r>
     </w:p>
     <w:p>
@@ -767,16 +789,16 @@
           <w:ilvl w:val="0"/>
           <w:numId w:val="2"/>
         </w:numPr>
-        <w:spacing w:before="13" w:after="26"/>
-      </w:pPr>
-      <w:r>
-        <w:rPr>
-          <w:rFonts w:ascii="Source Sans Pro" w:eastAsia="Source Sans Pro" w:hAnsi="Source Sans Pro" w:cs="Source Sans Pro"/>
-          <w:color w:val="000000"/>
-          <w:sz w:val="19"/>
-          <w:szCs w:val="19"/>
-        </w:rPr>
-        <w:t>Deployed Splunk SIEM with SPL correlation searches for brute-force detection, lateral movement, and privilege escalation; mapped TTPs to MITRE ATTandCK and wrote incident report.</w:t>
+        <w:spacing w:before="13" w:after="32"/>
+      </w:pPr>
+      <w:r>
+        <w:rPr>
+          <w:rFonts w:ascii="Source Sans Pro" w:eastAsia="Source Sans Pro" w:hAnsi="Source Sans Pro" w:cs="Source Sans Pro"/>
+          <w:color w:val="000000"/>
+          <w:sz w:val="19"/>
+          <w:szCs w:val="19"/>
+        </w:rPr>
+        <w:t>Deployed Splunk SIEM with SPL correlation searches for brute-force detection, lateral movement, and privilege escalation; mapped TTPs to MITRE ATT&amp;CK and wrote incident report.</w:t>
       </w:r>
     </w:p>
     <w:p>
@@ -786,16 +808,16 @@
           <w:ilvl w:val="0"/>
           <w:numId w:val="2"/>
         </w:numPr>
-        <w:spacing w:before="13" w:after="26"/>
-      </w:pPr>
-      <w:r>
-        <w:rPr>
-          <w:rFonts w:ascii="Source Sans Pro" w:eastAsia="Source Sans Pro" w:hAnsi="Source Sans Pro" w:cs="Source Sans Pro"/>
-          <w:color w:val="000000"/>
-          <w:sz w:val="19"/>
-          <w:szCs w:val="19"/>
-        </w:rPr>
-        <w:t>Developed SOAR-style detection pipeline using Python, ingesting Splunk alerts, enriching with VirusTotal API IOC data, and dispatching Telegram notifications with severity classification.</w:t>
+        <w:spacing w:before="13" w:after="32"/>
+      </w:pPr>
+      <w:r>
+        <w:rPr>
+          <w:rFonts w:ascii="Source Sans Pro" w:eastAsia="Source Sans Pro" w:hAnsi="Source Sans Pro" w:cs="Source Sans Pro"/>
+          <w:color w:val="000000"/>
+          <w:sz w:val="19"/>
+          <w:szCs w:val="19"/>
+        </w:rPr>
+        <w:t>Developed SOAR-style detection pipeline: Python script ingests Splunk alerts, enriches with VirusTotal API, and dispatches Telegram notifications with severity classification.</w:t>
       </w:r>
     </w:p>
     <w:p>
@@ -805,7 +827,7 @@
           <w:ilvl w:val="0"/>
           <w:numId w:val="2"/>
         </w:numPr>
-        <w:spacing w:before="13" w:after="26"/>
+        <w:spacing w:before="13" w:after="32"/>
       </w:pPr>
       <w:r>
         <w:rPr>
@@ -820,7 +842,7 @@
     <w:p>
       <w:pPr>
         <w:pStyle w:val="ListParagraph"/>
-        <w:spacing w:before="16" w:after="16"/>
+        <w:spacing w:before="23" w:after="23"/>
         <w:ind w:left="450"/>
       </w:pPr>
     </w:p>
@@ -829,7 +851,7 @@
         <w:pBdr>
           <w:bottom w:val="single" w:sz="6" w:space="1" w:color="000000"/>
         </w:pBdr>
-        <w:spacing w:before="85" w:after="0"/>
+        <w:spacing w:before="113" w:after="0"/>
       </w:pPr>
       <w:r>
         <w:rPr>
@@ -845,7 +867,7 @@
     </w:p>
     <w:p>
       <w:pPr>
-        <w:spacing w:before="40" w:after="40"/>
+        <w:spacing w:before="47" w:after="47"/>
       </w:pPr>
       <w:r>
         <w:rPr>
@@ -867,7 +889,7 @@
     </w:p>
     <w:p>
       <w:pPr>
-        <w:spacing w:before="40" w:after="40"/>
+        <w:spacing w:before="47" w:after="47"/>
       </w:pPr>
       <w:r>
         <w:rPr>
@@ -889,7 +911,7 @@
     </w:p>
     <w:p>
       <w:pPr>
-        <w:spacing w:before="40" w:after="40"/>
+        <w:spacing w:before="47" w:after="47"/>
       </w:pPr>
       <w:r>
         <w:rPr>
@@ -911,7 +933,7 @@
     </w:p>
     <w:p>
       <w:pPr>
-        <w:spacing w:before="40" w:after="40"/>
+        <w:spacing w:before="47" w:after="47"/>
       </w:pPr>
       <w:r>
         <w:rPr>
@@ -933,7 +955,7 @@
     </w:p>
     <w:p>
       <w:pPr>
-        <w:spacing w:before="40" w:after="29"/>
+        <w:spacing w:before="47" w:after="36"/>
       </w:pPr>
       <w:r>
         <w:rPr>
@@ -958,7 +980,7 @@
         <w:pBdr>
           <w:bottom w:val="single" w:sz="6" w:space="1" w:color="000000"/>
         </w:pBdr>
-        <w:spacing w:before="16" w:after="16"/>
+        <w:spacing w:before="23" w:after="23"/>
         <w:rPr>
           <w:rFonts w:ascii="Source Sans Pro" w:eastAsia="Source Sans Pro" w:hAnsi="Source Sans Pro" w:cs="Source Sans Pro"/>
           <w:b/>
@@ -974,7 +996,7 @@
         <w:pBdr>
           <w:bottom w:val="single" w:sz="6" w:space="1" w:color="000000"/>
         </w:pBdr>
-        <w:spacing w:before="85" w:after="0"/>
+        <w:spacing w:before="113" w:after="0"/>
       </w:pPr>
       <w:r>
         <w:rPr>
@@ -995,7 +1017,7 @@
           <w:ilvl w:val="0"/>
           <w:numId w:val="2"/>
         </w:numPr>
-        <w:spacing w:before="13" w:after="26"/>
+        <w:spacing w:before="13" w:after="32"/>
       </w:pPr>
       <w:r>
         <w:rPr>
@@ -1014,7 +1036,7 @@
           <w:ilvl w:val="0"/>
           <w:numId w:val="2"/>
         </w:numPr>
-        <w:spacing w:before="13" w:after="26"/>
+        <w:spacing w:before="13" w:after="32"/>
       </w:pPr>
       <w:r>
         <w:rPr>

</xml_diff>